<commit_message>
update for new word doc
</commit_message>
<xml_diff>
--- a/src/assets/Registry-Application-Questions_Mar2026.docx
+++ b/src/assets/Registry-Application-Questions_Mar2026.docx
@@ -1,6 +1,6 @@
 
 <file path=word/document.xml><?xml version="1.0" encoding="utf-8"?>
-<w:document xmlns:wpc="http://schemas.microsoft.com/office/word/2010/wordprocessingCanvas" xmlns:cx="http://schemas.microsoft.com/office/drawing/2014/chartex" xmlns:cx1="http://schemas.microsoft.com/office/drawing/2015/9/8/chartex" xmlns:cx2="http://schemas.microsoft.com/office/drawing/2015/10/21/chartex" xmlns:cx3="http://schemas.microsoft.com/office/drawing/2016/5/9/chartex" xmlns:cx4="http://schemas.microsoft.com/office/drawing/2016/5/10/chartex" xmlns:cx5="http://schemas.microsoft.com/office/drawing/2016/5/11/chartex" xmlns:cx6="http://schemas.microsoft.com/office/drawing/2016/5/12/chartex" xmlns:cx7="http://schemas.microsoft.com/office/drawing/2016/5/13/chartex" xmlns:cx8="http://schemas.microsoft.com/office/drawing/2016/5/14/chartex" xmlns:mc="http://schemas.openxmlformats.org/markup-compatibility/2006" xmlns:aink="http://schemas.microsoft.com/office/drawing/2016/ink" xmlns:am3d="http://schemas.microsoft.com/office/drawing/2017/model3d" xmlns:o="urn:schemas-microsoft-com:office:office" xmlns:oel="http://schemas.microsoft.com/office/2019/extlst" xmlns:r="http://schemas.openxmlformats.org/officeDocument/2006/relationships" xmlns:m="http://schemas.openxmlformats.org/officeDocument/2006/math" xmlns:v="urn:schemas-microsoft-com:vml" xmlns:wp14="http://schemas.microsoft.com/office/word/2010/wordprocessingDrawing" xmlns:wp="http://schemas.openxmlformats.org/drawingml/2006/wordprocessingDrawing" xmlns:w10="urn:schemas-microsoft-com:office:word" xmlns:w="http://schemas.openxmlformats.org/wordprocessingml/2006/main" xmlns:w14="http://schemas.microsoft.com/office/word/2010/wordml" xmlns:w15="http://schemas.microsoft.com/office/word/2012/wordml" xmlns:w16cex="http://schemas.microsoft.com/office/word/2018/wordml/cex" xmlns:w16cid="http://schemas.microsoft.com/office/word/2016/wordml/cid" xmlns:w16="http://schemas.microsoft.com/office/word/2018/wordml" xmlns:w16du="http://schemas.microsoft.com/office/word/2023/wordml/word16du" xmlns:w16sdtdh="http://schemas.microsoft.com/office/word/2020/wordml/sdtdatahash" xmlns:w16sdtfl="http://schemas.microsoft.com/office/word/2024/wordml/sdtformatlock" xmlns:w16se="http://schemas.microsoft.com/office/word/2015/wordml/symex" xmlns:wpg="http://schemas.microsoft.com/office/word/2010/wordprocessingGroup" xmlns:wpi="http://schemas.microsoft.com/office/word/2010/wordprocessingInk" xmlns:wne="http://schemas.microsoft.com/office/word/2006/wordml" xmlns:wps="http://schemas.microsoft.com/office/word/2010/wordprocessingShape" mc:Ignorable="w14 w15 w16se w16cid w16 w16cex w16sdtdh w16sdtfl w16du wp14">
+<w:document xmlns:wpc="http://schemas.microsoft.com/office/word/2010/wordprocessingCanvas" xmlns:cx="http://schemas.microsoft.com/office/drawing/2014/chartex" xmlns:cx1="http://schemas.microsoft.com/office/drawing/2015/9/8/chartex" xmlns:cx2="http://schemas.microsoft.com/office/drawing/2015/10/21/chartex" xmlns:cx3="http://schemas.microsoft.com/office/drawing/2016/5/9/chartex" xmlns:cx4="http://schemas.microsoft.com/office/drawing/2016/5/10/chartex" xmlns:cx5="http://schemas.microsoft.com/office/drawing/2016/5/11/chartex" xmlns:cx6="http://schemas.microsoft.com/office/drawing/2016/5/12/chartex" xmlns:cx7="http://schemas.microsoft.com/office/drawing/2016/5/13/chartex" xmlns:cx8="http://schemas.microsoft.com/office/drawing/2016/5/14/chartex" xmlns:mc="http://schemas.openxmlformats.org/markup-compatibility/2006" xmlns:m="http://schemas.openxmlformats.org/officeDocument/2006/math" xmlns:aink="http://schemas.microsoft.com/office/drawing/2016/ink" xmlns:am3d="http://schemas.microsoft.com/office/drawing/2017/model3d" xmlns:oel="http://schemas.microsoft.com/office/2019/extlst" xmlns:r="http://schemas.openxmlformats.org/officeDocument/2006/relationships" xmlns:wp14="http://schemas.microsoft.com/office/word/2010/wordprocessingDrawing" xmlns:wp="http://schemas.openxmlformats.org/drawingml/2006/wordprocessingDrawing" xmlns:wpg="http://schemas.microsoft.com/office/word/2010/wordprocessingGroup" xmlns:wpi="http://schemas.microsoft.com/office/word/2010/wordprocessingInk" xmlns:wps="http://schemas.microsoft.com/office/word/2010/wordprocessingShape" xmlns:o="urn:schemas-microsoft-com:office:office" xmlns:v="urn:schemas-microsoft-com:vml" xmlns:w10="urn:schemas-microsoft-com:office:word" xmlns:w="http://schemas.openxmlformats.org/wordprocessingml/2006/main" xmlns:w14="http://schemas.microsoft.com/office/word/2010/wordml" xmlns:w15="http://schemas.microsoft.com/office/word/2012/wordml" xmlns:w16cei="http://schemas.microsoft.com/office/word/2026/wordml/cei" xmlns:w16cex="http://schemas.microsoft.com/office/word/2018/wordml/cex" xmlns:w16cid="http://schemas.microsoft.com/office/word/2016/wordml/cid" xmlns:w16="http://schemas.microsoft.com/office/word/2018/wordml" xmlns:w16sdtdh="http://schemas.microsoft.com/office/word/2020/wordml/sdtdatahash" xmlns:w16sdtfl="http://schemas.microsoft.com/office/word/2024/wordml/sdtformatlock" xmlns:w16se="http://schemas.microsoft.com/office/word/2015/wordml/symex" xmlns:w16du="http://schemas.microsoft.com/office/word/2023/wordml/word16du" xmlns:wne="http://schemas.microsoft.com/office/word/2006/wordml" mc:Ignorable="w14 w15 w16se w16cid w16 w16cex w16sdtdh w16sdtfl w16du wp14">
   <w:body>
     <w:p>
       <w:pPr>
@@ -20,7 +20,7 @@
           <w:noProof/>
         </w:rPr>
         <w:drawing>
-          <wp:inline distT="0" distB="0" distL="0" distR="0" wp14:anchorId="76BDD528" wp14:editId="796185E5">
+          <wp:inline distT="0" distB="0" distL="0" distR="0" wp14:anchorId="76BDD528" wp14:editId="51E11C43">
             <wp:extent cx="2159000" cy="660400"/>
             <wp:effectExtent l="0" t="0" r="0" b="0"/>
             <wp:docPr id="1578819061" name="Picture 1" descr="A group of people in different colors&#10;&#10;AI-generated content may be incorrect."/>
@@ -226,16 +226,28 @@
         <w:rPr>
           <w:rFonts w:asciiTheme="minorHAnsi" w:hAnsiTheme="minorHAnsi" w:cstheme="minorHAnsi"/>
         </w:rPr>
-        <w:t>, among others. Climate adaptation teams or divisions within a larger organization should apply on behalf of that specific team rather than for the organization as a whole. Similarly, a team based in a regional or state office within a larger organization should apply on behalf of the team in that location.</w:t>
-      </w:r>
-    </w:p>
-    <w:p>
-      <w:pPr>
-        <w:spacing w:after="160"/>
-        <w:rPr>
-          <w:rFonts w:asciiTheme="minorHAnsi" w:hAnsiTheme="minorHAnsi" w:cstheme="minorHAnsi"/>
-          <w:b/>
-          <w:bCs/>
+        <w:t xml:space="preserve">, among others. Climate adaptation teams or divisions within a larger organization should apply on behalf of that specific team rather than for the </w:t>
+      </w:r>
+      <w:proofErr w:type="gramStart"/>
+      <w:r>
+        <w:rPr>
+          <w:rFonts w:asciiTheme="minorHAnsi" w:hAnsiTheme="minorHAnsi" w:cstheme="minorHAnsi"/>
+        </w:rPr>
+        <w:t>organization as a whole</w:t>
+      </w:r>
+      <w:proofErr w:type="gramEnd"/>
+      <w:r>
+        <w:rPr>
+          <w:rFonts w:asciiTheme="minorHAnsi" w:hAnsiTheme="minorHAnsi" w:cstheme="minorHAnsi"/>
+        </w:rPr>
+        <w:t>. Similarly, a team based in a regional or state office within a larger organization should apply on behalf of the team in that location.</w:t>
+      </w:r>
+    </w:p>
+    <w:p>
+      <w:pPr>
+        <w:spacing w:after="160"/>
+        <w:rPr>
+          <w:rFonts w:asciiTheme="minorHAnsi" w:hAnsiTheme="minorHAnsi" w:cstheme="minorHAnsi"/>
         </w:rPr>
       </w:pPr>
       <w:r>
@@ -256,8 +268,30 @@
         <w:rPr>
           <w:rFonts w:asciiTheme="minorHAnsi" w:hAnsiTheme="minorHAnsi" w:cstheme="minorHAnsi"/>
         </w:rPr>
-        <w:t xml:space="preserve">The application questions are designed to elicit the information that the Registry team needs to evaluate the organization's adaptation expertise and understanding of best practices in the field. Please provide as much information as possible on the online application, using the recommended word count as a guide to the level of detail we will require to evaluate your application. </w:t>
-      </w:r>
+        <w:t xml:space="preserve">The application questions are designed to elicit the information that the Registry </w:t>
+      </w:r>
+      <w:r>
+        <w:rPr>
+          <w:rFonts w:asciiTheme="minorHAnsi" w:hAnsiTheme="minorHAnsi" w:cstheme="minorHAnsi"/>
+        </w:rPr>
+        <w:t>staff</w:t>
+      </w:r>
+      <w:r>
+        <w:rPr>
+          <w:rFonts w:asciiTheme="minorHAnsi" w:hAnsiTheme="minorHAnsi" w:cstheme="minorHAnsi"/>
+        </w:rPr>
+        <w:t xml:space="preserve"> needs to evaluate the organization's adaptation expertise and understanding of best practices in the field. Please provide as much information as possible on the online application, using the recommended word count as a guide to the level of detail we will require to evaluate your application. </w:t>
+      </w:r>
+    </w:p>
+    <w:p>
+      <w:pPr>
+        <w:spacing w:after="160"/>
+        <w:rPr>
+          <w:rFonts w:asciiTheme="minorHAnsi" w:hAnsiTheme="minorHAnsi" w:cstheme="minorHAnsi"/>
+          <w:b/>
+          <w:bCs/>
+        </w:rPr>
+      </w:pPr>
       <w:r>
         <w:rPr>
           <w:rFonts w:asciiTheme="minorHAnsi" w:hAnsiTheme="minorHAnsi" w:cstheme="minorHAnsi"/>
@@ -270,7 +304,23 @@
           <w:b/>
           <w:bCs/>
         </w:rPr>
-        <w:t>Please do not use AI to draft your answers!</w:t>
+        <w:t>Do</w:t>
+      </w:r>
+      <w:r>
+        <w:rPr>
+          <w:rFonts w:asciiTheme="minorHAnsi" w:hAnsiTheme="minorHAnsi" w:cstheme="minorHAnsi"/>
+          <w:b/>
+          <w:bCs/>
+        </w:rPr>
+        <w:t xml:space="preserve"> not use AI to draft your answers!</w:t>
+      </w:r>
+      <w:r>
+        <w:rPr>
+          <w:rFonts w:asciiTheme="minorHAnsi" w:hAnsiTheme="minorHAnsi" w:cstheme="minorHAnsi"/>
+          <w:b/>
+          <w:bCs/>
+        </w:rPr>
+        <w:t xml:space="preserve"> Applications with detected use of AI will be automatically rejected.</w:t>
       </w:r>
       <w:r>
         <w:rPr>
@@ -430,13 +480,13 @@
         <w:rPr>
           <w:rFonts w:asciiTheme="minorHAnsi" w:hAnsiTheme="minorHAnsi" w:cstheme="minorHAnsi"/>
         </w:rPr>
-        <w:t xml:space="preserve"> (or team)</w:t>
-      </w:r>
-      <w:r>
-        <w:rPr>
-          <w:rFonts w:asciiTheme="minorHAnsi" w:hAnsiTheme="minorHAnsi" w:cstheme="minorHAnsi"/>
-        </w:rPr>
-        <w:t xml:space="preserve"> on the Registry</w:t>
+        <w:t xml:space="preserve"> </w:t>
+      </w:r>
+      <w:r>
+        <w:rPr>
+          <w:rFonts w:asciiTheme="minorHAnsi" w:hAnsiTheme="minorHAnsi" w:cstheme="minorHAnsi"/>
+        </w:rPr>
+        <w:t>on the Registry</w:t>
       </w:r>
       <w:r>
         <w:rPr>
@@ -608,7 +658,19 @@
         <w:rPr>
           <w:rFonts w:asciiTheme="minorHAnsi" w:hAnsiTheme="minorHAnsi" w:cstheme="minorHAnsi"/>
         </w:rPr>
-        <w:t>If applying as a team within a larger organization, please include both your team and organization name.</w:t>
+        <w:t>If applying as a team within a larger organization, please include both your team</w:t>
+      </w:r>
+      <w:r>
+        <w:rPr>
+          <w:rFonts w:asciiTheme="minorHAnsi" w:hAnsiTheme="minorHAnsi" w:cstheme="minorHAnsi"/>
+        </w:rPr>
+        <w:t xml:space="preserve"> or division name</w:t>
+      </w:r>
+      <w:r>
+        <w:rPr>
+          <w:rFonts w:asciiTheme="minorHAnsi" w:hAnsiTheme="minorHAnsi" w:cstheme="minorHAnsi"/>
+        </w:rPr>
+        <w:t xml:space="preserve"> and organization name.</w:t>
       </w:r>
     </w:p>
     <w:p>
@@ -851,7 +913,7 @@
         <w:rPr>
           <w:rFonts w:asciiTheme="minorHAnsi" w:hAnsiTheme="minorHAnsi" w:cstheme="minorHAnsi"/>
         </w:rPr>
-        <w:t>Number of people within your organization or team/division focused on climate adaptation and resilience</w:t>
+        <w:t>Number of people within your organization focused on climate adaptation and resilience</w:t>
       </w:r>
       <w:r>
         <w:rPr>
@@ -871,15 +933,7 @@
           <w:i/>
           <w:iCs/>
         </w:rPr>
-        <w:t>(</w:t>
-      </w:r>
-      <w:r>
-        <w:rPr>
-          <w:rFonts w:asciiTheme="minorHAnsi" w:hAnsiTheme="minorHAnsi" w:cstheme="minorHAnsi"/>
-          <w:i/>
-          <w:iCs/>
-        </w:rPr>
-        <w:t>select one)</w:t>
+        <w:t>(select one)</w:t>
       </w:r>
     </w:p>
     <w:p>
@@ -993,7 +1047,24 @@
           <w:rFonts w:asciiTheme="minorHAnsi" w:hAnsiTheme="minorHAnsi" w:cstheme="minorHAnsi"/>
         </w:rPr>
         <w:tab/>
-        <w:t xml:space="preserve">1-10 employees </w:t>
+      </w:r>
+      <w:r>
+        <w:rPr>
+          <w:rFonts w:asciiTheme="minorHAnsi" w:hAnsiTheme="minorHAnsi" w:cstheme="minorHAnsi"/>
+        </w:rPr>
+        <w:t>2</w:t>
+      </w:r>
+      <w:r>
+        <w:rPr>
+          <w:rFonts w:asciiTheme="minorHAnsi" w:hAnsiTheme="minorHAnsi" w:cstheme="minorHAnsi"/>
+        </w:rPr>
+        <w:t>-10 employees</w:t>
+      </w:r>
+      <w:r>
+        <w:rPr>
+          <w:rFonts w:asciiTheme="minorHAnsi" w:hAnsiTheme="minorHAnsi" w:cstheme="minorHAnsi"/>
+        </w:rPr>
+        <w:t xml:space="preserve"> </w:t>
       </w:r>
     </w:p>
     <w:p>
@@ -1871,7 +1942,7 @@
         <w:rPr>
           <w:rFonts w:asciiTheme="minorHAnsi" w:hAnsiTheme="minorHAnsi" w:cstheme="minorHAnsi"/>
         </w:rPr>
-        <w:t>Have members of your organization (or team) completed any training programs or certificates specifically related to climate adaptation or resilience</w:t>
+        <w:t>Have members of your organization completed any training programs or certificates specifically related to climate adaptation or resilience</w:t>
       </w:r>
       <w:r>
         <w:rPr>
@@ -2029,21 +2100,21 @@
         <w:rPr>
           <w:rFonts w:asciiTheme="minorHAnsi" w:hAnsiTheme="minorHAnsi" w:cstheme="minorHAnsi"/>
         </w:rPr>
-        <w:t>How many years has your organization (or team) been working in the field of climate adaptation and resilience?</w:t>
-      </w:r>
-    </w:p>
-    <w:p>
-      <w:pPr>
-        <w:spacing w:after="160"/>
-        <w:rPr>
-          <w:rFonts w:asciiTheme="minorHAnsi" w:hAnsiTheme="minorHAnsi" w:cstheme="minorHAnsi"/>
-        </w:rPr>
-      </w:pPr>
-      <w:r>
-        <w:rPr>
-          <w:rFonts w:asciiTheme="minorHAnsi" w:hAnsiTheme="minorHAnsi" w:cstheme="minorHAnsi"/>
-        </w:rPr>
-        <w:t>Please provide any additional information you want us to know about your organization's (or team's) background and qualifications to provide adaptation services</w:t>
+        <w:t>How many years has your organization been working in the field of climate adaptation and resilience?</w:t>
+      </w:r>
+    </w:p>
+    <w:p>
+      <w:pPr>
+        <w:spacing w:after="160"/>
+        <w:rPr>
+          <w:rFonts w:asciiTheme="minorHAnsi" w:hAnsiTheme="minorHAnsi" w:cstheme="minorHAnsi"/>
+        </w:rPr>
+      </w:pPr>
+      <w:r>
+        <w:rPr>
+          <w:rFonts w:asciiTheme="minorHAnsi" w:hAnsiTheme="minorHAnsi" w:cstheme="minorHAnsi"/>
+        </w:rPr>
+        <w:t>Please provide any additional information you want us to know about your organization's background and qualifications to provide adaptation services</w:t>
       </w:r>
       <w:r>
         <w:rPr>
@@ -2097,7 +2168,7 @@
         <w:rPr>
           <w:rFonts w:asciiTheme="minorHAnsi" w:hAnsiTheme="minorHAnsi" w:cstheme="minorHAnsi"/>
         </w:rPr>
-        <w:t>The goal of this section is to elicit information about your organization’s (or team's) services, areas of expertise, and focus, and will be used to match you with communities that are seeking assistance</w:t>
+        <w:t>The goal of this section is to elicit information about your organization’s services, areas of expertise, and focus, and will be used to match you with communities that are seeking assistance</w:t>
       </w:r>
       <w:r>
         <w:rPr>
@@ -3189,7 +3260,7 @@
           <w:rFonts w:asciiTheme="minorHAnsi" w:hAnsiTheme="minorHAnsi" w:cstheme="minorHAnsi"/>
         </w:rPr>
         <w:lastRenderedPageBreak/>
-        <w:t>What sectors does your organization (or team) have expertise in?</w:t>
+        <w:t>What sectors does your organization have expertise in?</w:t>
       </w:r>
       <w:r>
         <w:rPr>
@@ -4038,15 +4109,25 @@
         <w:spacing w:after="80"/>
         <w:rPr>
           <w:rFonts w:asciiTheme="minorHAnsi" w:hAnsiTheme="minorHAnsi" w:cstheme="minorHAnsi"/>
-          <w:b/>
-          <w:bCs/>
-        </w:rPr>
-      </w:pPr>
-      <w:r>
-        <w:rPr>
-          <w:rFonts w:asciiTheme="minorHAnsi" w:hAnsiTheme="minorHAnsi" w:cstheme="minorHAnsi"/>
-        </w:rPr>
-        <w:t>What climate hazards does your organization (or team) have expertise in?</w:t>
+          <w:highlight w:val="yellow"/>
+        </w:rPr>
+      </w:pPr>
+    </w:p>
+    <w:p>
+      <w:pPr>
+        <w:keepNext/>
+        <w:spacing w:after="80"/>
+        <w:rPr>
+          <w:rFonts w:asciiTheme="minorHAnsi" w:hAnsiTheme="minorHAnsi" w:cstheme="minorHAnsi"/>
+          <w:b/>
+          <w:bCs/>
+        </w:rPr>
+      </w:pPr>
+      <w:r>
+        <w:rPr>
+          <w:rFonts w:asciiTheme="minorHAnsi" w:hAnsiTheme="minorHAnsi" w:cstheme="minorHAnsi"/>
+        </w:rPr>
+        <w:t>What climate hazards does your organization have expertise in?</w:t>
       </w:r>
       <w:r>
         <w:rPr>
@@ -4784,15 +4865,23 @@
         <w:spacing w:after="160"/>
         <w:rPr>
           <w:rFonts w:asciiTheme="minorHAnsi" w:hAnsiTheme="minorHAnsi" w:cstheme="minorHAnsi"/>
-          <w:b/>
-          <w:bCs/>
-        </w:rPr>
-      </w:pPr>
-      <w:r>
-        <w:rPr>
-          <w:rFonts w:asciiTheme="minorHAnsi" w:hAnsiTheme="minorHAnsi" w:cstheme="minorHAnsi"/>
-        </w:rPr>
-        <w:t>Which U.S. states and territories would your organization (or team) be willing and able to work in</w:t>
+        </w:rPr>
+      </w:pPr>
+    </w:p>
+    <w:p>
+      <w:pPr>
+        <w:spacing w:after="160"/>
+        <w:rPr>
+          <w:rFonts w:asciiTheme="minorHAnsi" w:hAnsiTheme="minorHAnsi" w:cstheme="minorHAnsi"/>
+          <w:b/>
+          <w:bCs/>
+        </w:rPr>
+      </w:pPr>
+      <w:r>
+        <w:rPr>
+          <w:rFonts w:asciiTheme="minorHAnsi" w:hAnsiTheme="minorHAnsi" w:cstheme="minorHAnsi"/>
+        </w:rPr>
+        <w:t>Which U.S. states and territories would your organization be willing and able to work in</w:t>
       </w:r>
       <w:r>
         <w:rPr>
@@ -4846,37 +4935,17 @@
           <w:sz w:val="20"/>
           <w:szCs w:val="20"/>
         </w:rPr>
-        <w:t xml:space="preserve"> work outside the U.S., please scroll to the bottom of the list </w:t>
-      </w:r>
-      <w:r>
+        <w:t xml:space="preserve"> work outside the U.S., please scroll to the bottom of the list on the online form and enter the country where you work.</w:t>
+      </w:r>
+    </w:p>
+    <w:p>
+      <w:pPr>
+        <w:keepNext/>
+        <w:spacing w:after="80"/>
         <w:rPr>
           <w:rFonts w:asciiTheme="minorHAnsi" w:hAnsiTheme="minorHAnsi" w:cstheme="minorHAnsi"/>
           <w:i/>
           <w:iCs/>
-          <w:sz w:val="20"/>
-          <w:szCs w:val="20"/>
-        </w:rPr>
-        <w:t xml:space="preserve">on the online form </w:t>
-      </w:r>
-      <w:r>
-        <w:rPr>
-          <w:rFonts w:asciiTheme="minorHAnsi" w:hAnsiTheme="minorHAnsi" w:cstheme="minorHAnsi"/>
-          <w:i/>
-          <w:iCs/>
-          <w:sz w:val="20"/>
-          <w:szCs w:val="20"/>
-        </w:rPr>
-        <w:t>and enter the country where you work.</w:t>
-      </w:r>
-    </w:p>
-    <w:p>
-      <w:pPr>
-        <w:keepNext/>
-        <w:spacing w:after="80"/>
-        <w:rPr>
-          <w:rFonts w:asciiTheme="minorHAnsi" w:hAnsiTheme="minorHAnsi" w:cstheme="minorHAnsi"/>
-          <w:i/>
-          <w:iCs/>
         </w:rPr>
       </w:pPr>
       <w:r>
@@ -4884,7 +4953,7 @@
           <w:rFonts w:asciiTheme="minorHAnsi" w:hAnsiTheme="minorHAnsi" w:cstheme="minorHAnsi"/>
         </w:rPr>
         <w:lastRenderedPageBreak/>
-        <w:t>What size communities does your organization (or team) have experience working with?</w:t>
+        <w:t>What size communities does your organization have experience working with?</w:t>
       </w:r>
       <w:r>
         <w:rPr>
@@ -5378,7 +5447,7 @@
         <w:rPr>
           <w:rFonts w:asciiTheme="minorHAnsi" w:hAnsiTheme="minorHAnsi" w:cstheme="minorHAnsi"/>
         </w:rPr>
-        <w:t>Are members of your organization (or team) fluent in any languages other than English?</w:t>
+        <w:t>Are members of your organization fluent in any languages other than English?</w:t>
       </w:r>
     </w:p>
     <w:p>
@@ -5645,7 +5714,7 @@
         <w:rPr>
           <w:rFonts w:asciiTheme="minorHAnsi" w:hAnsiTheme="minorHAnsi" w:cstheme="minorHAnsi"/>
         </w:rPr>
-        <w:t>Please provide at least 2 and up to 3 examples of projects that your organization (or team) has completed.</w:t>
+        <w:t>Please provide at least 2 and up to 3 examples of projects that your organization has completed.</w:t>
       </w:r>
       <w:r>
         <w:rPr>
@@ -5757,7 +5826,21 @@
         <w:rPr>
           <w:rFonts w:asciiTheme="minorHAnsi" w:hAnsiTheme="minorHAnsi" w:cstheme="minorHAnsi"/>
         </w:rPr>
-        <w:t xml:space="preserve"> (e.g, </w:t>
+        <w:t xml:space="preserve"> (</w:t>
+      </w:r>
+      <w:proofErr w:type="spellStart"/>
+      <w:r>
+        <w:rPr>
+          <w:rFonts w:asciiTheme="minorHAnsi" w:hAnsiTheme="minorHAnsi" w:cstheme="minorHAnsi"/>
+        </w:rPr>
+        <w:t>e.g</w:t>
+      </w:r>
+      <w:proofErr w:type="spellEnd"/>
+      <w:r>
+        <w:rPr>
+          <w:rFonts w:asciiTheme="minorHAnsi" w:hAnsiTheme="minorHAnsi" w:cstheme="minorHAnsi"/>
+        </w:rPr>
+        <w:t xml:space="preserve">, </w:t>
       </w:r>
       <w:r>
         <w:rPr>
@@ -5980,53 +6063,53 @@
           <w:b/>
           <w:bCs/>
         </w:rPr>
+        <w:t>P</w:t>
+      </w:r>
+      <w:r>
+        <w:rPr>
+          <w:rFonts w:asciiTheme="minorHAnsi" w:hAnsiTheme="minorHAnsi" w:cstheme="minorHAnsi"/>
+          <w:b/>
+          <w:bCs/>
+        </w:rPr>
+        <w:t>rovide corroborating materials for at least one of the examples you provide</w:t>
+      </w:r>
+      <w:r>
+        <w:rPr>
+          <w:rFonts w:asciiTheme="minorHAnsi" w:hAnsiTheme="minorHAnsi" w:cstheme="minorHAnsi"/>
+        </w:rPr>
+        <w:t>, and preferably all of them. T</w:t>
+      </w:r>
+      <w:r>
+        <w:rPr>
+          <w:rFonts w:asciiTheme="minorHAnsi" w:hAnsiTheme="minorHAnsi" w:cstheme="minorHAnsi"/>
+        </w:rPr>
+        <w:t>o the extent possible</w:t>
+      </w:r>
+      <w:r>
+        <w:rPr>
+          <w:rFonts w:asciiTheme="minorHAnsi" w:hAnsiTheme="minorHAnsi" w:cstheme="minorHAnsi"/>
+        </w:rPr>
+        <w:t xml:space="preserve">, </w:t>
+      </w:r>
+      <w:r>
+        <w:rPr>
+          <w:rFonts w:asciiTheme="minorHAnsi" w:hAnsiTheme="minorHAnsi" w:cstheme="minorHAnsi"/>
+        </w:rPr>
+        <w:t>please share materials that specifically identify you as a contributor or leader, as appropriate, in project documentation.</w:t>
+      </w:r>
+    </w:p>
+    <w:p>
+      <w:pPr>
+        <w:spacing w:after="160"/>
+        <w:rPr>
+          <w:rFonts w:asciiTheme="minorHAnsi" w:hAnsiTheme="minorHAnsi" w:cstheme="minorHAnsi"/>
+        </w:rPr>
+      </w:pPr>
+      <w:r>
+        <w:rPr>
+          <w:rFonts w:asciiTheme="minorHAnsi" w:hAnsiTheme="minorHAnsi" w:cstheme="minorHAnsi"/>
+        </w:rPr>
         <w:lastRenderedPageBreak/>
-        <w:t>P</w:t>
-      </w:r>
-      <w:r>
-        <w:rPr>
-          <w:rFonts w:asciiTheme="minorHAnsi" w:hAnsiTheme="minorHAnsi" w:cstheme="minorHAnsi"/>
-          <w:b/>
-          <w:bCs/>
-        </w:rPr>
-        <w:t>rovide corroborating materials for at least one of the examples you provide</w:t>
-      </w:r>
-      <w:r>
-        <w:rPr>
-          <w:rFonts w:asciiTheme="minorHAnsi" w:hAnsiTheme="minorHAnsi" w:cstheme="minorHAnsi"/>
-        </w:rPr>
-        <w:t>, and preferably all of them. T</w:t>
-      </w:r>
-      <w:r>
-        <w:rPr>
-          <w:rFonts w:asciiTheme="minorHAnsi" w:hAnsiTheme="minorHAnsi" w:cstheme="minorHAnsi"/>
-        </w:rPr>
-        <w:t>o the extent possible</w:t>
-      </w:r>
-      <w:r>
-        <w:rPr>
-          <w:rFonts w:asciiTheme="minorHAnsi" w:hAnsiTheme="minorHAnsi" w:cstheme="minorHAnsi"/>
-        </w:rPr>
-        <w:t xml:space="preserve">, </w:t>
-      </w:r>
-      <w:r>
-        <w:rPr>
-          <w:rFonts w:asciiTheme="minorHAnsi" w:hAnsiTheme="minorHAnsi" w:cstheme="minorHAnsi"/>
-        </w:rPr>
-        <w:t>please share materials that specifically identify you as a contributor or leader, as appropriate, in project documentation.</w:t>
-      </w:r>
-    </w:p>
-    <w:p>
-      <w:pPr>
-        <w:spacing w:after="160"/>
-        <w:rPr>
-          <w:rFonts w:asciiTheme="minorHAnsi" w:hAnsiTheme="minorHAnsi" w:cstheme="minorHAnsi"/>
-        </w:rPr>
-      </w:pPr>
-      <w:r>
-        <w:rPr>
-          <w:rFonts w:asciiTheme="minorHAnsi" w:hAnsiTheme="minorHAnsi" w:cstheme="minorHAnsi"/>
-        </w:rPr>
         <w:t>Please note the minimum word count and ensure you answer the question that is being asked. S</w:t>
       </w:r>
       <w:r>
@@ -6717,7 +6800,6 @@
           <w:bCs/>
           <w:u w:val="single"/>
         </w:rPr>
-        <w:lastRenderedPageBreak/>
         <w:t>Example #</w:t>
       </w:r>
       <w:r>
@@ -6838,6 +6920,7 @@
         <w:rPr>
           <w:rFonts w:asciiTheme="minorHAnsi" w:hAnsiTheme="minorHAnsi" w:cstheme="minorHAnsi"/>
         </w:rPr>
+        <w:lastRenderedPageBreak/>
         <w:t>Project location</w:t>
       </w:r>
       <w:r>
@@ -7077,7 +7160,7 @@
         <w:rPr>
           <w:rFonts w:asciiTheme="minorHAnsi" w:hAnsiTheme="minorHAnsi" w:cstheme="minorHAnsi"/>
         </w:rPr>
-        <w:t>This section asks you to provide more detailed information about the extent of your organization's (or team's) background, experience, and philosophy related to several foundational concepts in adaptation, and are used to evaluate your expertise regarding best practices in the field.</w:t>
+        <w:t>This section asks you to provide more detailed information about the extent of your organization's background, experience, and philosophy related to several foundational concepts in adaptation, and are used to evaluate your expertise regarding best practices in the field.</w:t>
       </w:r>
     </w:p>
     <w:p>
@@ -7109,21 +7192,39 @@
           <w:b/>
           <w:bCs/>
         </w:rPr>
-        <w:t>**Do not use AI to draft your answers! This does not allow us to assess your expertise. If we suspect AI use (i.e., if the tone/content does not match the rest of your application), we will reject your application and ask you to reapply.**</w:t>
-      </w:r>
-    </w:p>
-    <w:p>
-      <w:pPr>
-        <w:spacing w:after="160"/>
-        <w:rPr>
-          <w:rFonts w:asciiTheme="minorHAnsi" w:hAnsiTheme="minorHAnsi" w:cstheme="minorHAnsi"/>
-        </w:rPr>
-      </w:pPr>
-      <w:r>
-        <w:rPr>
-          <w:rFonts w:asciiTheme="minorHAnsi" w:hAnsiTheme="minorHAnsi" w:cstheme="minorHAnsi"/>
-        </w:rPr>
-        <w:t xml:space="preserve">What is your organization's (or team's) approach </w:t>
+        <w:t xml:space="preserve">**Do not use AI to draft your answers! This does not allow us to assess your expertise. If we suspect AI use (i.e., if the tone/content does not match the rest of your application), we will reject your application and ask you to </w:t>
+      </w:r>
+      <w:proofErr w:type="gramStart"/>
+      <w:r>
+        <w:rPr>
+          <w:rFonts w:asciiTheme="minorHAnsi" w:hAnsiTheme="minorHAnsi" w:cstheme="minorHAnsi"/>
+          <w:b/>
+          <w:bCs/>
+        </w:rPr>
+        <w:t>reapply.*</w:t>
+      </w:r>
+      <w:proofErr w:type="gramEnd"/>
+      <w:r>
+        <w:rPr>
+          <w:rFonts w:asciiTheme="minorHAnsi" w:hAnsiTheme="minorHAnsi" w:cstheme="minorHAnsi"/>
+          <w:b/>
+          <w:bCs/>
+        </w:rPr>
+        <w:t>*</w:t>
+      </w:r>
+    </w:p>
+    <w:p>
+      <w:pPr>
+        <w:spacing w:after="160"/>
+        <w:rPr>
+          <w:rFonts w:asciiTheme="minorHAnsi" w:hAnsiTheme="minorHAnsi" w:cstheme="minorHAnsi"/>
+        </w:rPr>
+      </w:pPr>
+      <w:r>
+        <w:rPr>
+          <w:rFonts w:asciiTheme="minorHAnsi" w:hAnsiTheme="minorHAnsi" w:cstheme="minorHAnsi"/>
+        </w:rPr>
+        <w:t xml:space="preserve">What is your organization's approach </w:t>
       </w:r>
       <w:r>
         <w:rPr>
@@ -7167,13 +7268,7 @@
         <w:rPr>
           <w:rFonts w:asciiTheme="minorHAnsi" w:hAnsiTheme="minorHAnsi" w:cstheme="minorHAnsi"/>
         </w:rPr>
-        <w:t>What is your organization's (or team's) approach to ensuring stakeholder engagement (e.g., community members, managers, decision makers) in a project?</w:t>
-      </w:r>
-      <w:r>
-        <w:rPr>
-          <w:rFonts w:asciiTheme="minorHAnsi" w:hAnsiTheme="minorHAnsi" w:cstheme="minorHAnsi"/>
-        </w:rPr>
-        <w:t xml:space="preserve"> </w:t>
+        <w:t xml:space="preserve">What is your organization's approach to ensuring stakeholder engagement (e.g., community members, managers, decision makers) in a project? </w:t>
       </w:r>
       <w:r>
         <w:rPr>
@@ -7189,7 +7284,7 @@
           <w:i/>
           <w:iCs/>
         </w:rPr>
-        <w:t>100-</w:t>
+        <w:t>100-300 words</w:t>
       </w:r>
       <w:r>
         <w:rPr>
@@ -7197,7 +7292,21 @@
           <w:i/>
           <w:iCs/>
         </w:rPr>
-        <w:t>300 words</w:t>
+        <w:t>)</w:t>
+      </w:r>
+    </w:p>
+    <w:p>
+      <w:pPr>
+        <w:spacing w:after="160"/>
+        <w:rPr>
+          <w:rFonts w:asciiTheme="minorHAnsi" w:hAnsiTheme="minorHAnsi" w:cstheme="minorHAnsi"/>
+        </w:rPr>
+      </w:pPr>
+      <w:r>
+        <w:rPr>
+          <w:rFonts w:asciiTheme="minorHAnsi" w:hAnsiTheme="minorHAnsi" w:cstheme="minorHAnsi"/>
+        </w:rPr>
+        <w:t xml:space="preserve">What is your organization's (approach to considering equity across all dimensions of a project? </w:t>
       </w:r>
       <w:r>
         <w:rPr>
@@ -7205,21 +7314,7 @@
           <w:i/>
           <w:iCs/>
         </w:rPr>
-        <w:t>)</w:t>
-      </w:r>
-    </w:p>
-    <w:p>
-      <w:pPr>
-        <w:spacing w:after="160"/>
-        <w:rPr>
-          <w:rFonts w:asciiTheme="minorHAnsi" w:hAnsiTheme="minorHAnsi" w:cstheme="minorHAnsi"/>
-        </w:rPr>
-      </w:pPr>
-      <w:r>
-        <w:rPr>
-          <w:rFonts w:asciiTheme="minorHAnsi" w:hAnsiTheme="minorHAnsi" w:cstheme="minorHAnsi"/>
-        </w:rPr>
-        <w:t xml:space="preserve">What is your organization's (or team's) approach to considering equity across all dimensions of a project? </w:t>
+        <w:t>(</w:t>
       </w:r>
       <w:r>
         <w:rPr>
@@ -7227,7 +7322,7 @@
           <w:i/>
           <w:iCs/>
         </w:rPr>
-        <w:t>(</w:t>
+        <w:t>100-300 words</w:t>
       </w:r>
       <w:r>
         <w:rPr>
@@ -7235,7 +7330,21 @@
           <w:i/>
           <w:iCs/>
         </w:rPr>
-        <w:t>100-</w:t>
+        <w:t>)</w:t>
+      </w:r>
+    </w:p>
+    <w:p>
+      <w:pPr>
+        <w:spacing w:after="160"/>
+        <w:rPr>
+          <w:rFonts w:asciiTheme="minorHAnsi" w:hAnsiTheme="minorHAnsi" w:cstheme="minorHAnsi"/>
+        </w:rPr>
+      </w:pPr>
+      <w:r>
+        <w:rPr>
+          <w:rFonts w:asciiTheme="minorHAnsi" w:hAnsiTheme="minorHAnsi" w:cstheme="minorHAnsi"/>
+        </w:rPr>
+        <w:t xml:space="preserve">How does your organization evaluate the potential for unintended consequences or maladaptation that may stem from your projects? </w:t>
       </w:r>
       <w:r>
         <w:rPr>
@@ -7243,7 +7352,7 @@
           <w:i/>
           <w:iCs/>
         </w:rPr>
-        <w:t>300 words</w:t>
+        <w:t>(</w:t>
       </w:r>
       <w:r>
         <w:rPr>
@@ -7251,21 +7360,7 @@
           <w:i/>
           <w:iCs/>
         </w:rPr>
-        <w:t>)</w:t>
-      </w:r>
-    </w:p>
-    <w:p>
-      <w:pPr>
-        <w:spacing w:after="160"/>
-        <w:rPr>
-          <w:rFonts w:asciiTheme="minorHAnsi" w:hAnsiTheme="minorHAnsi" w:cstheme="minorHAnsi"/>
-        </w:rPr>
-      </w:pPr>
-      <w:r>
-        <w:rPr>
-          <w:rFonts w:asciiTheme="minorHAnsi" w:hAnsiTheme="minorHAnsi" w:cstheme="minorHAnsi"/>
-        </w:rPr>
-        <w:t xml:space="preserve">How does your organization (or team) evaluate the potential for unintended consequences or maladaptation that may stem from your projects? </w:t>
+        <w:t>100-300 words</w:t>
       </w:r>
       <w:r>
         <w:rPr>
@@ -7273,30 +7368,6 @@
           <w:i/>
           <w:iCs/>
         </w:rPr>
-        <w:t>(</w:t>
-      </w:r>
-      <w:r>
-        <w:rPr>
-          <w:rFonts w:asciiTheme="minorHAnsi" w:hAnsiTheme="minorHAnsi" w:cstheme="minorHAnsi"/>
-          <w:i/>
-          <w:iCs/>
-        </w:rPr>
-        <w:t>100-</w:t>
-      </w:r>
-      <w:r>
-        <w:rPr>
-          <w:rFonts w:asciiTheme="minorHAnsi" w:hAnsiTheme="minorHAnsi" w:cstheme="minorHAnsi"/>
-          <w:i/>
-          <w:iCs/>
-        </w:rPr>
-        <w:t>300 words</w:t>
-      </w:r>
-      <w:r>
-        <w:rPr>
-          <w:rFonts w:asciiTheme="minorHAnsi" w:hAnsiTheme="minorHAnsi" w:cstheme="minorHAnsi"/>
-          <w:i/>
-          <w:iCs/>
-        </w:rPr>
         <w:t>)</w:t>
       </w:r>
     </w:p>
@@ -7347,7 +7418,6 @@
           <w:sz w:val="28"/>
           <w:szCs w:val="28"/>
         </w:rPr>
-        <w:lastRenderedPageBreak/>
         <w:t xml:space="preserve">If Accepted </w:t>
       </w:r>
       <w:r>
@@ -7429,6 +7499,7 @@
         <w:rPr>
           <w:rFonts w:asciiTheme="minorHAnsi" w:hAnsiTheme="minorHAnsi" w:cstheme="minorHAnsi"/>
         </w:rPr>
+        <w:lastRenderedPageBreak/>
         <w:t xml:space="preserve">The Registry includes two categories of </w:t>
       </w:r>
       <w:r>
@@ -7527,7 +7598,21 @@
         <w:rPr>
           <w:rFonts w:asciiTheme="minorHAnsi" w:hAnsiTheme="minorHAnsi" w:cstheme="minorHAnsi"/>
         </w:rPr>
-        <w:t>. The categories exist only to improve the user experience on the Registry, no benefits or drawbacks are associated with being in one or the other.</w:t>
+        <w:t xml:space="preserve">. The categories exist only to improve the user experience on the </w:t>
+      </w:r>
+      <w:proofErr w:type="gramStart"/>
+      <w:r>
+        <w:rPr>
+          <w:rFonts w:asciiTheme="minorHAnsi" w:hAnsiTheme="minorHAnsi" w:cstheme="minorHAnsi"/>
+        </w:rPr>
+        <w:t>Registry,</w:t>
+      </w:r>
+      <w:proofErr w:type="gramEnd"/>
+      <w:r>
+        <w:rPr>
+          <w:rFonts w:asciiTheme="minorHAnsi" w:hAnsiTheme="minorHAnsi" w:cstheme="minorHAnsi"/>
+        </w:rPr>
+        <w:t xml:space="preserve"> no benefits or drawbacks are associated with being in one or the other.</w:t>
       </w:r>
     </w:p>
     <w:p>
@@ -7682,13 +7767,7 @@
         <w:rPr>
           <w:rFonts w:asciiTheme="minorHAnsi" w:hAnsiTheme="minorHAnsi" w:cstheme="minorHAnsi"/>
         </w:rPr>
-        <w:t>Please submit a brief description of your organization (or team) to be displayed on your Registry profile page</w:t>
-      </w:r>
-      <w:r>
-        <w:rPr>
-          <w:rFonts w:asciiTheme="minorHAnsi" w:hAnsiTheme="minorHAnsi" w:cstheme="minorHAnsi"/>
-        </w:rPr>
-        <w:t xml:space="preserve"> </w:t>
+        <w:t xml:space="preserve">Please submit a brief description of your organization to be displayed on your Registry profile page </w:t>
       </w:r>
       <w:r>
         <w:rPr>
@@ -7917,7 +7996,7 @@
 </file>
 
 <file path=word/endnotes.xml><?xml version="1.0" encoding="utf-8"?>
-<w:endnotes xmlns:wpc="http://schemas.microsoft.com/office/word/2010/wordprocessingCanvas" xmlns:cx="http://schemas.microsoft.com/office/drawing/2014/chartex" xmlns:cx1="http://schemas.microsoft.com/office/drawing/2015/9/8/chartex" xmlns:cx2="http://schemas.microsoft.com/office/drawing/2015/10/21/chartex" xmlns:cx3="http://schemas.microsoft.com/office/drawing/2016/5/9/chartex" xmlns:cx4="http://schemas.microsoft.com/office/drawing/2016/5/10/chartex" xmlns:cx5="http://schemas.microsoft.com/office/drawing/2016/5/11/chartex" xmlns:cx6="http://schemas.microsoft.com/office/drawing/2016/5/12/chartex" xmlns:cx7="http://schemas.microsoft.com/office/drawing/2016/5/13/chartex" xmlns:cx8="http://schemas.microsoft.com/office/drawing/2016/5/14/chartex" xmlns:mc="http://schemas.openxmlformats.org/markup-compatibility/2006" xmlns:aink="http://schemas.microsoft.com/office/drawing/2016/ink" xmlns:am3d="http://schemas.microsoft.com/office/drawing/2017/model3d" xmlns:o="urn:schemas-microsoft-com:office:office" xmlns:oel="http://schemas.microsoft.com/office/2019/extlst" xmlns:r="http://schemas.openxmlformats.org/officeDocument/2006/relationships" xmlns:m="http://schemas.openxmlformats.org/officeDocument/2006/math" xmlns:v="urn:schemas-microsoft-com:vml" xmlns:wp14="http://schemas.microsoft.com/office/word/2010/wordprocessingDrawing" xmlns:wp="http://schemas.openxmlformats.org/drawingml/2006/wordprocessingDrawing" xmlns:w10="urn:schemas-microsoft-com:office:word" xmlns:w="http://schemas.openxmlformats.org/wordprocessingml/2006/main" xmlns:w14="http://schemas.microsoft.com/office/word/2010/wordml" xmlns:w15="http://schemas.microsoft.com/office/word/2012/wordml" xmlns:w16cex="http://schemas.microsoft.com/office/word/2018/wordml/cex" xmlns:w16cid="http://schemas.microsoft.com/office/word/2016/wordml/cid" xmlns:w16="http://schemas.microsoft.com/office/word/2018/wordml" xmlns:w16du="http://schemas.microsoft.com/office/word/2023/wordml/word16du" xmlns:w16sdtdh="http://schemas.microsoft.com/office/word/2020/wordml/sdtdatahash" xmlns:w16sdtfl="http://schemas.microsoft.com/office/word/2024/wordml/sdtformatlock" xmlns:w16se="http://schemas.microsoft.com/office/word/2015/wordml/symex" xmlns:wpg="http://schemas.microsoft.com/office/word/2010/wordprocessingGroup" xmlns:wpi="http://schemas.microsoft.com/office/word/2010/wordprocessingInk" xmlns:wne="http://schemas.microsoft.com/office/word/2006/wordml" xmlns:wps="http://schemas.microsoft.com/office/word/2010/wordprocessingShape" mc:Ignorable="w14 w15 w16se w16cid w16 w16cex w16sdtdh w16sdtfl w16du wp14">
+<w:endnotes xmlns:wpc="http://schemas.microsoft.com/office/word/2010/wordprocessingCanvas" xmlns:cx="http://schemas.microsoft.com/office/drawing/2014/chartex" xmlns:cx1="http://schemas.microsoft.com/office/drawing/2015/9/8/chartex" xmlns:cx2="http://schemas.microsoft.com/office/drawing/2015/10/21/chartex" xmlns:cx3="http://schemas.microsoft.com/office/drawing/2016/5/9/chartex" xmlns:cx4="http://schemas.microsoft.com/office/drawing/2016/5/10/chartex" xmlns:cx5="http://schemas.microsoft.com/office/drawing/2016/5/11/chartex" xmlns:cx6="http://schemas.microsoft.com/office/drawing/2016/5/12/chartex" xmlns:cx7="http://schemas.microsoft.com/office/drawing/2016/5/13/chartex" xmlns:cx8="http://schemas.microsoft.com/office/drawing/2016/5/14/chartex" xmlns:mc="http://schemas.openxmlformats.org/markup-compatibility/2006" xmlns:m="http://schemas.openxmlformats.org/officeDocument/2006/math" xmlns:aink="http://schemas.microsoft.com/office/drawing/2016/ink" xmlns:am3d="http://schemas.microsoft.com/office/drawing/2017/model3d" xmlns:oel="http://schemas.microsoft.com/office/2019/extlst" xmlns:r="http://schemas.openxmlformats.org/officeDocument/2006/relationships" xmlns:wp14="http://schemas.microsoft.com/office/word/2010/wordprocessingDrawing" xmlns:wp="http://schemas.openxmlformats.org/drawingml/2006/wordprocessingDrawing" xmlns:wpg="http://schemas.microsoft.com/office/word/2010/wordprocessingGroup" xmlns:wpi="http://schemas.microsoft.com/office/word/2010/wordprocessingInk" xmlns:wps="http://schemas.microsoft.com/office/word/2010/wordprocessingShape" xmlns:o="urn:schemas-microsoft-com:office:office" xmlns:v="urn:schemas-microsoft-com:vml" xmlns:w10="urn:schemas-microsoft-com:office:word" xmlns:w="http://schemas.openxmlformats.org/wordprocessingml/2006/main" xmlns:w14="http://schemas.microsoft.com/office/word/2010/wordml" xmlns:w15="http://schemas.microsoft.com/office/word/2012/wordml" xmlns:w16cei="http://schemas.microsoft.com/office/word/2026/wordml/cei" xmlns:w16cex="http://schemas.microsoft.com/office/word/2018/wordml/cex" xmlns:w16cid="http://schemas.microsoft.com/office/word/2016/wordml/cid" xmlns:w16="http://schemas.microsoft.com/office/word/2018/wordml" xmlns:w16sdtdh="http://schemas.microsoft.com/office/word/2020/wordml/sdtdatahash" xmlns:w16sdtfl="http://schemas.microsoft.com/office/word/2024/wordml/sdtformatlock" xmlns:w16se="http://schemas.microsoft.com/office/word/2015/wordml/symex" xmlns:w16du="http://schemas.microsoft.com/office/word/2023/wordml/word16du" xmlns:wne="http://schemas.microsoft.com/office/word/2006/wordml" mc:Ignorable="w14 w15 w16se w16cid w16 w16cex w16sdtdh w16sdtfl w16du wp14">
   <w:endnote w:type="separator" w:id="-1">
     <w:p>
       <w:r>
@@ -7936,7 +8015,7 @@
 </file>
 
 <file path=word/footnotes.xml><?xml version="1.0" encoding="utf-8"?>
-<w:footnotes xmlns:wpc="http://schemas.microsoft.com/office/word/2010/wordprocessingCanvas" xmlns:cx="http://schemas.microsoft.com/office/drawing/2014/chartex" xmlns:cx1="http://schemas.microsoft.com/office/drawing/2015/9/8/chartex" xmlns:cx2="http://schemas.microsoft.com/office/drawing/2015/10/21/chartex" xmlns:cx3="http://schemas.microsoft.com/office/drawing/2016/5/9/chartex" xmlns:cx4="http://schemas.microsoft.com/office/drawing/2016/5/10/chartex" xmlns:cx5="http://schemas.microsoft.com/office/drawing/2016/5/11/chartex" xmlns:cx6="http://schemas.microsoft.com/office/drawing/2016/5/12/chartex" xmlns:cx7="http://schemas.microsoft.com/office/drawing/2016/5/13/chartex" xmlns:cx8="http://schemas.microsoft.com/office/drawing/2016/5/14/chartex" xmlns:mc="http://schemas.openxmlformats.org/markup-compatibility/2006" xmlns:aink="http://schemas.microsoft.com/office/drawing/2016/ink" xmlns:am3d="http://schemas.microsoft.com/office/drawing/2017/model3d" xmlns:o="urn:schemas-microsoft-com:office:office" xmlns:oel="http://schemas.microsoft.com/office/2019/extlst" xmlns:r="http://schemas.openxmlformats.org/officeDocument/2006/relationships" xmlns:m="http://schemas.openxmlformats.org/officeDocument/2006/math" xmlns:v="urn:schemas-microsoft-com:vml" xmlns:wp14="http://schemas.microsoft.com/office/word/2010/wordprocessingDrawing" xmlns:wp="http://schemas.openxmlformats.org/drawingml/2006/wordprocessingDrawing" xmlns:w10="urn:schemas-microsoft-com:office:word" xmlns:w="http://schemas.openxmlformats.org/wordprocessingml/2006/main" xmlns:w14="http://schemas.microsoft.com/office/word/2010/wordml" xmlns:w15="http://schemas.microsoft.com/office/word/2012/wordml" xmlns:w16cex="http://schemas.microsoft.com/office/word/2018/wordml/cex" xmlns:w16cid="http://schemas.microsoft.com/office/word/2016/wordml/cid" xmlns:w16="http://schemas.microsoft.com/office/word/2018/wordml" xmlns:w16du="http://schemas.microsoft.com/office/word/2023/wordml/word16du" xmlns:w16sdtdh="http://schemas.microsoft.com/office/word/2020/wordml/sdtdatahash" xmlns:w16sdtfl="http://schemas.microsoft.com/office/word/2024/wordml/sdtformatlock" xmlns:w16se="http://schemas.microsoft.com/office/word/2015/wordml/symex" xmlns:wpg="http://schemas.microsoft.com/office/word/2010/wordprocessingGroup" xmlns:wpi="http://schemas.microsoft.com/office/word/2010/wordprocessingInk" xmlns:wne="http://schemas.microsoft.com/office/word/2006/wordml" xmlns:wps="http://schemas.microsoft.com/office/word/2010/wordprocessingShape" mc:Ignorable="w14 w15 w16se w16cid w16 w16cex w16sdtdh w16sdtfl w16du wp14">
+<w:footnotes xmlns:wpc="http://schemas.microsoft.com/office/word/2010/wordprocessingCanvas" xmlns:cx="http://schemas.microsoft.com/office/drawing/2014/chartex" xmlns:cx1="http://schemas.microsoft.com/office/drawing/2015/9/8/chartex" xmlns:cx2="http://schemas.microsoft.com/office/drawing/2015/10/21/chartex" xmlns:cx3="http://schemas.microsoft.com/office/drawing/2016/5/9/chartex" xmlns:cx4="http://schemas.microsoft.com/office/drawing/2016/5/10/chartex" xmlns:cx5="http://schemas.microsoft.com/office/drawing/2016/5/11/chartex" xmlns:cx6="http://schemas.microsoft.com/office/drawing/2016/5/12/chartex" xmlns:cx7="http://schemas.microsoft.com/office/drawing/2016/5/13/chartex" xmlns:cx8="http://schemas.microsoft.com/office/drawing/2016/5/14/chartex" xmlns:mc="http://schemas.openxmlformats.org/markup-compatibility/2006" xmlns:m="http://schemas.openxmlformats.org/officeDocument/2006/math" xmlns:aink="http://schemas.microsoft.com/office/drawing/2016/ink" xmlns:am3d="http://schemas.microsoft.com/office/drawing/2017/model3d" xmlns:oel="http://schemas.microsoft.com/office/2019/extlst" xmlns:r="http://schemas.openxmlformats.org/officeDocument/2006/relationships" xmlns:wp14="http://schemas.microsoft.com/office/word/2010/wordprocessingDrawing" xmlns:wp="http://schemas.openxmlformats.org/drawingml/2006/wordprocessingDrawing" xmlns:wpg="http://schemas.microsoft.com/office/word/2010/wordprocessingGroup" xmlns:wpi="http://schemas.microsoft.com/office/word/2010/wordprocessingInk" xmlns:wps="http://schemas.microsoft.com/office/word/2010/wordprocessingShape" xmlns:o="urn:schemas-microsoft-com:office:office" xmlns:v="urn:schemas-microsoft-com:vml" xmlns:w10="urn:schemas-microsoft-com:office:word" xmlns:w="http://schemas.openxmlformats.org/wordprocessingml/2006/main" xmlns:w14="http://schemas.microsoft.com/office/word/2010/wordml" xmlns:w15="http://schemas.microsoft.com/office/word/2012/wordml" xmlns:w16cei="http://schemas.microsoft.com/office/word/2026/wordml/cei" xmlns:w16cex="http://schemas.microsoft.com/office/word/2018/wordml/cex" xmlns:w16cid="http://schemas.microsoft.com/office/word/2016/wordml/cid" xmlns:w16="http://schemas.microsoft.com/office/word/2018/wordml" xmlns:w16sdtdh="http://schemas.microsoft.com/office/word/2020/wordml/sdtdatahash" xmlns:w16sdtfl="http://schemas.microsoft.com/office/word/2024/wordml/sdtformatlock" xmlns:w16se="http://schemas.microsoft.com/office/word/2015/wordml/symex" xmlns:w16du="http://schemas.microsoft.com/office/word/2023/wordml/word16du" xmlns:wne="http://schemas.microsoft.com/office/word/2006/wordml" mc:Ignorable="w14 w15 w16se w16cid w16 w16cex w16sdtdh w16sdtfl w16du wp14">
   <w:footnote w:type="separator" w:id="-1">
     <w:p>
       <w:r>
@@ -7955,7 +8034,7 @@
 </file>
 
 <file path=word/numbering.xml><?xml version="1.0" encoding="utf-8"?>
-<w:numbering xmlns:wpc="http://schemas.microsoft.com/office/word/2010/wordprocessingCanvas" xmlns:cx="http://schemas.microsoft.com/office/drawing/2014/chartex" xmlns:cx1="http://schemas.microsoft.com/office/drawing/2015/9/8/chartex" xmlns:cx2="http://schemas.microsoft.com/office/drawing/2015/10/21/chartex" xmlns:cx3="http://schemas.microsoft.com/office/drawing/2016/5/9/chartex" xmlns:cx4="http://schemas.microsoft.com/office/drawing/2016/5/10/chartex" xmlns:cx5="http://schemas.microsoft.com/office/drawing/2016/5/11/chartex" xmlns:cx6="http://schemas.microsoft.com/office/drawing/2016/5/12/chartex" xmlns:cx7="http://schemas.microsoft.com/office/drawing/2016/5/13/chartex" xmlns:cx8="http://schemas.microsoft.com/office/drawing/2016/5/14/chartex" xmlns:mc="http://schemas.openxmlformats.org/markup-compatibility/2006" xmlns:aink="http://schemas.microsoft.com/office/drawing/2016/ink" xmlns:am3d="http://schemas.microsoft.com/office/drawing/2017/model3d" xmlns:o="urn:schemas-microsoft-com:office:office" xmlns:oel="http://schemas.microsoft.com/office/2019/extlst" xmlns:r="http://schemas.openxmlformats.org/officeDocument/2006/relationships" xmlns:m="http://schemas.openxmlformats.org/officeDocument/2006/math" xmlns:v="urn:schemas-microsoft-com:vml" xmlns:wp14="http://schemas.microsoft.com/office/word/2010/wordprocessingDrawing" xmlns:wp="http://schemas.openxmlformats.org/drawingml/2006/wordprocessingDrawing" xmlns:w10="urn:schemas-microsoft-com:office:word" xmlns:w="http://schemas.openxmlformats.org/wordprocessingml/2006/main" xmlns:w14="http://schemas.microsoft.com/office/word/2010/wordml" xmlns:w15="http://schemas.microsoft.com/office/word/2012/wordml" xmlns:w16cex="http://schemas.microsoft.com/office/word/2018/wordml/cex" xmlns:w16cid="http://schemas.microsoft.com/office/word/2016/wordml/cid" xmlns:w16="http://schemas.microsoft.com/office/word/2018/wordml" xmlns:w16du="http://schemas.microsoft.com/office/word/2023/wordml/word16du" xmlns:w16sdtdh="http://schemas.microsoft.com/office/word/2020/wordml/sdtdatahash" xmlns:w16sdtfl="http://schemas.microsoft.com/office/word/2024/wordml/sdtformatlock" xmlns:w16se="http://schemas.microsoft.com/office/word/2015/wordml/symex" xmlns:wpg="http://schemas.microsoft.com/office/word/2010/wordprocessingGroup" xmlns:wpi="http://schemas.microsoft.com/office/word/2010/wordprocessingInk" xmlns:wne="http://schemas.microsoft.com/office/word/2006/wordml" xmlns:wps="http://schemas.microsoft.com/office/word/2010/wordprocessingShape" mc:Ignorable="w14 w15 w16se w16cid w16 w16cex w16sdtdh w16sdtfl w16du wp14">
+<w:numbering xmlns:wpc="http://schemas.microsoft.com/office/word/2010/wordprocessingCanvas" xmlns:cx="http://schemas.microsoft.com/office/drawing/2014/chartex" xmlns:cx1="http://schemas.microsoft.com/office/drawing/2015/9/8/chartex" xmlns:cx2="http://schemas.microsoft.com/office/drawing/2015/10/21/chartex" xmlns:cx3="http://schemas.microsoft.com/office/drawing/2016/5/9/chartex" xmlns:cx4="http://schemas.microsoft.com/office/drawing/2016/5/10/chartex" xmlns:cx5="http://schemas.microsoft.com/office/drawing/2016/5/11/chartex" xmlns:cx6="http://schemas.microsoft.com/office/drawing/2016/5/12/chartex" xmlns:cx7="http://schemas.microsoft.com/office/drawing/2016/5/13/chartex" xmlns:cx8="http://schemas.microsoft.com/office/drawing/2016/5/14/chartex" xmlns:mc="http://schemas.openxmlformats.org/markup-compatibility/2006" xmlns:m="http://schemas.openxmlformats.org/officeDocument/2006/math" xmlns:aink="http://schemas.microsoft.com/office/drawing/2016/ink" xmlns:am3d="http://schemas.microsoft.com/office/drawing/2017/model3d" xmlns:oel="http://schemas.microsoft.com/office/2019/extlst" xmlns:r="http://schemas.openxmlformats.org/officeDocument/2006/relationships" xmlns:wp14="http://schemas.microsoft.com/office/word/2010/wordprocessingDrawing" xmlns:wp="http://schemas.openxmlformats.org/drawingml/2006/wordprocessingDrawing" xmlns:wpg="http://schemas.microsoft.com/office/word/2010/wordprocessingGroup" xmlns:wpi="http://schemas.microsoft.com/office/word/2010/wordprocessingInk" xmlns:wps="http://schemas.microsoft.com/office/word/2010/wordprocessingShape" xmlns:o="urn:schemas-microsoft-com:office:office" xmlns:v="urn:schemas-microsoft-com:vml" xmlns:w10="urn:schemas-microsoft-com:office:word" xmlns:w="http://schemas.openxmlformats.org/wordprocessingml/2006/main" xmlns:w14="http://schemas.microsoft.com/office/word/2010/wordml" xmlns:w15="http://schemas.microsoft.com/office/word/2012/wordml" xmlns:w16cei="http://schemas.microsoft.com/office/word/2026/wordml/cei" xmlns:w16cex="http://schemas.microsoft.com/office/word/2018/wordml/cex" xmlns:w16cid="http://schemas.microsoft.com/office/word/2016/wordml/cid" xmlns:w16="http://schemas.microsoft.com/office/word/2018/wordml" xmlns:w16sdtdh="http://schemas.microsoft.com/office/word/2020/wordml/sdtdatahash" xmlns:w16sdtfl="http://schemas.microsoft.com/office/word/2024/wordml/sdtformatlock" xmlns:w16se="http://schemas.microsoft.com/office/word/2015/wordml/symex" xmlns:w16du="http://schemas.microsoft.com/office/word/2023/wordml/word16du" xmlns:wne="http://schemas.microsoft.com/office/word/2006/wordml" mc:Ignorable="w14 w15 w16se w16cid w16 w16cex w16sdtdh w16sdtfl w16du wp14">
   <w:abstractNum w:abstractNumId="0" w15:restartNumberingAfterBreak="0">
     <w:nsid w:val="1A503741"/>
     <w:multiLevelType w:val="hybridMultilevel"/>
@@ -8656,7 +8735,7 @@
 </file>
 
 <file path=word/styles.xml><?xml version="1.0" encoding="utf-8"?>
-<w:styles xmlns:mc="http://schemas.openxmlformats.org/markup-compatibility/2006" xmlns:r="http://schemas.openxmlformats.org/officeDocument/2006/relationships" xmlns:w="http://schemas.openxmlformats.org/wordprocessingml/2006/main" xmlns:w14="http://schemas.microsoft.com/office/word/2010/wordml" xmlns:w15="http://schemas.microsoft.com/office/word/2012/wordml" xmlns:w16cex="http://schemas.microsoft.com/office/word/2018/wordml/cex" xmlns:w16cid="http://schemas.microsoft.com/office/word/2016/wordml/cid" xmlns:w16="http://schemas.microsoft.com/office/word/2018/wordml" xmlns:w16du="http://schemas.microsoft.com/office/word/2023/wordml/word16du" xmlns:w16sdtdh="http://schemas.microsoft.com/office/word/2020/wordml/sdtdatahash" xmlns:w16sdtfl="http://schemas.microsoft.com/office/word/2024/wordml/sdtformatlock" xmlns:w16se="http://schemas.microsoft.com/office/word/2015/wordml/symex" mc:Ignorable="w14 w15 w16se w16cid w16 w16cex w16sdtdh w16sdtfl w16du">
+<w:styles xmlns:mc="http://schemas.openxmlformats.org/markup-compatibility/2006" xmlns:r="http://schemas.openxmlformats.org/officeDocument/2006/relationships" xmlns:w="http://schemas.openxmlformats.org/wordprocessingml/2006/main" xmlns:w14="http://schemas.microsoft.com/office/word/2010/wordml" xmlns:w15="http://schemas.microsoft.com/office/word/2012/wordml" xmlns:w16cex="http://schemas.microsoft.com/office/word/2018/wordml/cex" xmlns:w16cid="http://schemas.microsoft.com/office/word/2016/wordml/cid" xmlns:w16="http://schemas.microsoft.com/office/word/2018/wordml" xmlns:w16sdtdh="http://schemas.microsoft.com/office/word/2020/wordml/sdtdatahash" xmlns:w16sdtfl="http://schemas.microsoft.com/office/word/2024/wordml/sdtformatlock" xmlns:w16se="http://schemas.microsoft.com/office/word/2015/wordml/symex" xmlns:w16du="http://schemas.microsoft.com/office/word/2023/wordml/word16du" mc:Ignorable="w14 w15 w16se w16cid w16 w16cex w16sdtdh w16sdtfl w16du">
   <w:docDefaults>
     <w:rPrDefault>
       <w:rPr>

</xml_diff>